<commit_message>
feat: update portfolio with xVenture, new experiences, certifications, and activities
</commit_message>
<xml_diff>
--- a/CV.docx
+++ b/CV.docx
@@ -2,7 +2,7 @@
 <file path=word/document.xml><?xml version="1.0" encoding="utf-8"?>
 <w:document xmlns:w="http://schemas.openxmlformats.org/wordprocessingml/2006/main" xmlns:m="http://schemas.openxmlformats.org/officeDocument/2006/math" xmlns:r="http://schemas.openxmlformats.org/officeDocument/2006/relationships" xmlns:o="urn:schemas-microsoft-com:office:office" xmlns:v="urn:schemas-microsoft-com:vml" xmlns:w10="urn:schemas-microsoft-com:office:word" xmlns:a="http://schemas.openxmlformats.org/drawingml/2006/main" xmlns:pic="http://schemas.openxmlformats.org/drawingml/2006/picture" xmlns:wp="http://schemas.openxmlformats.org/drawingml/2006/wordprocessingDrawing">
   <w:body>
-    <w:bookmarkStart w:id="41" w:name="X047b946bbeec3ea31eca6e71b7bcc118e9ae977"/>
+    <w:bookmarkStart w:id="71" w:name="X047b946bbeec3ea31eca6e71b7bcc118e9ae977"/>
     <w:p>
       <w:pPr>
         <w:pStyle w:val="Heading1"/>
@@ -16,7 +16,19 @@
         <w:pStyle w:val="FirstParagraph"/>
       </w:pPr>
       <w:r>
-        <w:t xml:space="preserve">Email: abdurrauf.sakenov@proton.me Phone: +7 (776) 004 41 05 Telegram:</w:t>
+        <w:t xml:space="preserve">Email: abdurrauf.sakenov@proton.me</w:t>
+      </w:r>
+      <w:r>
+        <w:t xml:space="preserve"> </w:t>
+      </w:r>
+      <w:r>
+        <w:t xml:space="preserve">Phone: +7 (776) 004 41 05</w:t>
+      </w:r>
+      <w:r>
+        <w:t xml:space="preserve"> </w:t>
+      </w:r>
+      <w:r>
+        <w:t xml:space="preserve">Telegram:</w:t>
       </w:r>
       <w:r>
         <w:t xml:space="preserve"> </w:t>
@@ -26,17 +38,34 @@
           <w:rPr>
             <w:rStyle w:val="Hyperlink"/>
           </w:rPr>
-          <w:t xml:space="preserve">@defiveninth</w:t>
+          <w:t xml:space="preserve">@abdurrvuf</w:t>
         </w:r>
       </w:hyperlink>
       <w:r>
-        <w:br/>
+        <w:t xml:space="preserve"> </w:t>
+      </w:r>
+      <w:r>
+        <w:t xml:space="preserve">Instagram:</w:t>
+      </w:r>
+      <w:r>
+        <w:t xml:space="preserve"> </w:t>
+      </w:r>
+      <w:hyperlink r:id="rId10">
+        <w:r>
+          <w:rPr>
+            <w:rStyle w:val="Hyperlink"/>
+          </w:rPr>
+          <w:t xml:space="preserve">@abdurrvuf</w:t>
+        </w:r>
+      </w:hyperlink>
+      <w:r>
+        <w:t xml:space="preserve"> </w:t>
       </w:r>
       <w:r>
         <w:t xml:space="preserve">Языки: Казахский (родной), Русский (свободный), Английский (B1)</w:t>
       </w:r>
     </w:p>
-    <w:bookmarkStart w:id="10" w:name="обо-мне"/>
+    <w:bookmarkStart w:id="11" w:name="обо-мне"/>
     <w:p>
       <w:pPr>
         <w:pStyle w:val="Heading2"/>
@@ -50,7 +79,39 @@
         <w:pStyle w:val="FirstParagraph"/>
       </w:pPr>
       <w:r>
-        <w:t xml:space="preserve">AI-Native Фуллстек &amp; Мобильный инженер с опытом 3+ года. Глубоко владею</w:t>
+        <w:t xml:space="preserve">xVenture - CTO команды</w:t>
+      </w:r>
+      <w:r>
+        <w:t xml:space="preserve"> </w:t>
+      </w:r>
+      <w:r>
+        <w:t xml:space="preserve">AIStartify Academy - Владелец &amp; CEO</w:t>
+      </w:r>
+      <w:r>
+        <w:t xml:space="preserve"> </w:t>
+      </w:r>
+      <w:r>
+        <w:t xml:space="preserve">LVMH - Operations &amp; Supply Chain</w:t>
+      </w:r>
+      <w:r>
+        <w:t xml:space="preserve"> </w:t>
+      </w:r>
+      <w:r>
+        <w:t xml:space="preserve">Narxoz DTT - AI &amp; Software Engineer (CO-OP)</w:t>
+      </w:r>
+      <w:r>
+        <w:t xml:space="preserve"> </w:t>
+      </w:r>
+      <w:r>
+        <w:t xml:space="preserve">AIStartify - Разработчик</w:t>
+      </w:r>
+    </w:p>
+    <w:p>
+      <w:pPr>
+        <w:pStyle w:val="BodyText"/>
+      </w:pPr>
+      <w:r>
+        <w:t xml:space="preserve">AI-Native Фуллстек &amp; Мобильный инженер с опытом 4+ года. Глубоко владею</w:t>
       </w:r>
       <w:r>
         <w:t xml:space="preserve"> </w:t>
@@ -92,11 +153,11 @@
         <w:t xml:space="preserve">Swift</w:t>
       </w:r>
       <w:r>
-        <w:t xml:space="preserve">. Разрабатываю отказоустойчивый backend, проектирую масштабируемые API-решения и создаю мобильные и веб-продукты с глубокой интеграцией БД. Имею практический опыт в EdTech, стартап-командах, цифровизации образовательных процессов вуза. Прикрутил платежку Kaspi для веба и прошел весь квест с публикацией приложения в Google Play.</w:t>
-      </w:r>
-    </w:p>
-    <w:bookmarkEnd w:id="10"/>
-    <w:bookmarkStart w:id="11" w:name="навыки"/>
+        <w:t xml:space="preserve">. Имею практический опыт в EdTech, стартап-командах, цифровизации образовательных процессов вуза.</w:t>
+      </w:r>
+    </w:p>
+    <w:bookmarkEnd w:id="11"/>
+    <w:bookmarkStart w:id="12" w:name="навыки"/>
     <w:p>
       <w:pPr>
         <w:pStyle w:val="Heading2"/>
@@ -168,7 +229,7 @@
         <w:t xml:space="preserve"> </w:t>
       </w:r>
       <w:r>
-        <w:t xml:space="preserve">Nest.js, Express.js, Fastify.js, Prisma, TypeORM, PostgreSQL, MySQL, SQLite, MongoDB, Redis, json, GraphQL, websocket, HTTP, RestAPI, NextAuth, JWT</w:t>
+        <w:t xml:space="preserve">Nest.js, Express.js, FastAPI, Fastify.js, Prisma, TypeORM, PostgreSQL, MySQL, SQLite, MongoDB, Redis, json, GraphQL, websocket, HTTP, RestAPI, NextAuth, JWT</w:t>
       </w:r>
     </w:p>
     <w:p>
@@ -190,7 +251,7 @@
         <w:t xml:space="preserve"> </w:t>
       </w:r>
       <w:r>
-        <w:t xml:space="preserve">Gemini API, Google AI Studio, chatGPT, Claude Code, QWEN, Ollama, Cursor, Antigravity, GitHub Copilot, Codex, OpenCode, NoteLLM</w:t>
+        <w:t xml:space="preserve">MCP (Model Context Protocol), LibreChat, Gemini API, Google AI Studio, chatGPT, Claude Code, QWEN, Ollama, Cursor, Antigravity, GitHub Copilot, Codex, OpenCode, NoteLLM</w:t>
       </w:r>
     </w:p>
     <w:p>
@@ -215,8 +276,8 @@
         <w:t xml:space="preserve">VSCode, XCode, Git, Docker, Vercel, Google Play Console, V0, Remix</w:t>
       </w:r>
     </w:p>
-    <w:bookmarkEnd w:id="11"/>
-    <w:bookmarkStart w:id="15" w:name="опыт-работы"/>
+    <w:bookmarkEnd w:id="12"/>
+    <w:bookmarkStart w:id="19" w:name="опыт-работы"/>
     <w:p>
       <w:pPr>
         <w:pStyle w:val="Heading2"/>
@@ -225,7 +286,145 @@
         <w:t xml:space="preserve">Опыт работы</w:t>
       </w:r>
     </w:p>
-    <w:bookmarkStart w:id="12" w:name="Xfd10941811e170a2ba65e7f74a56307a700f8e2"/>
+    <w:bookmarkStart w:id="13" w:name="xventure-cto-tech-lead"/>
+    <w:p>
+      <w:pPr>
+        <w:pStyle w:val="Heading3"/>
+      </w:pPr>
+      <w:r>
+        <w:t xml:space="preserve">xVenture | CTO &amp; Tech Lead</w:t>
+      </w:r>
+    </w:p>
+    <w:p>
+      <w:pPr>
+        <w:pStyle w:val="FirstParagraph"/>
+      </w:pPr>
+      <w:r>
+        <w:rPr>
+          <w:i/>
+          <w:iCs/>
+        </w:rPr>
+        <w:t xml:space="preserve">08.2026 — по настоящее время (AI-симулятор питчинга, Telegram Mini App)</w:t>
+      </w:r>
+      <w:r>
+        <w:t xml:space="preserve"> </w:t>
+      </w:r>
+      <w:r>
+        <w:t xml:space="preserve">- Руководство инженерной командой (5+ разработчиков): менторство, код-ревью и онбординг</w:t>
+      </w:r>
+      <w:r>
+        <w:t xml:space="preserve"> </w:t>
+      </w:r>
+      <w:r>
+        <w:t xml:space="preserve">- Постановка процессов разработки (SDLC) в связке Linear + GitLab и контроль релизов</w:t>
+      </w:r>
+      <w:r>
+        <w:t xml:space="preserve"> </w:t>
+      </w:r>
+      <w:r>
+        <w:t xml:space="preserve">- Архитектурное руководство экосистемой из 4+ микросервисов (Next.js, Fastify, AI-core)</w:t>
+      </w:r>
+      <w:r>
+        <w:t xml:space="preserve"> </w:t>
+      </w:r>
+      <w:r>
+        <w:t xml:space="preserve">- Проектирование игровой механики AI-батлов, честного ELO-лидерборда и экономики</w:t>
+      </w:r>
+      <w:r>
+        <w:t xml:space="preserve"> </w:t>
+      </w:r>
+      <w:r>
+        <w:t xml:space="preserve">- Внедрение CI/CD Quality Gates, автотестов критической логики и защиты от Pay-to-Win</w:t>
+      </w:r>
+    </w:p>
+    <w:bookmarkEnd w:id="13"/>
+    <w:bookmarkStart w:id="14" w:name="lvmh-стажер-operations-supply-chain"/>
+    <w:p>
+      <w:pPr>
+        <w:pStyle w:val="Heading3"/>
+      </w:pPr>
+      <w:r>
+        <w:t xml:space="preserve">LVMH | Стажер | Operations &amp; Supply Chain</w:t>
+      </w:r>
+    </w:p>
+    <w:p>
+      <w:pPr>
+        <w:pStyle w:val="FirstParagraph"/>
+      </w:pPr>
+      <w:r>
+        <w:rPr>
+          <w:i/>
+          <w:iCs/>
+        </w:rPr>
+        <w:t xml:space="preserve">09.2026 — по настоящее время (Люксовый ритейл, цепочки поставок)</w:t>
+      </w:r>
+      <w:r>
+        <w:t xml:space="preserve"> </w:t>
+      </w:r>
+      <w:r>
+        <w:t xml:space="preserve">- Изучение и анализ сквозных логистических цепочек и операционных процессов группы LVMH</w:t>
+      </w:r>
+      <w:r>
+        <w:t xml:space="preserve"> </w:t>
+      </w:r>
+      <w:r>
+        <w:t xml:space="preserve">- Мониторинг движения товарных запасов, оптимизация складских потоков и внутренних регламентов поставок</w:t>
+      </w:r>
+      <w:r>
+        <w:t xml:space="preserve"> </w:t>
+      </w:r>
+      <w:r>
+        <w:t xml:space="preserve">- Погружение в бизнес-стандарты управления качеством, аналитики и операционной эффективности мирового luxury-бренда</w:t>
+      </w:r>
+    </w:p>
+    <w:bookmarkEnd w:id="14"/>
+    <w:bookmarkStart w:id="15" w:name="Xcf5ac3c60592946053a3c4b97f2d9951ae8074c"/>
+    <w:p>
+      <w:pPr>
+        <w:pStyle w:val="Heading3"/>
+      </w:pPr>
+      <w:r>
+        <w:t xml:space="preserve">Narxoz University | AI &amp; Software Engineer (CO-OP)</w:t>
+      </w:r>
+    </w:p>
+    <w:p>
+      <w:pPr>
+        <w:pStyle w:val="FirstParagraph"/>
+      </w:pPr>
+      <w:r>
+        <w:rPr>
+          <w:i/>
+          <w:iCs/>
+        </w:rPr>
+        <w:t xml:space="preserve">09.2026 — по настоящее время (Департамент цифровых технологий и инноваций)</w:t>
+      </w:r>
+      <w:r>
+        <w:t xml:space="preserve"> </w:t>
+      </w:r>
+      <w:r>
+        <w:t xml:space="preserve">- Разработка и внедрение production MCP-серверов (Model Context Protocol over SSE/stdio) на Python (FastAPI) для интеграции LLM-ассистентов с корпоративным LibreChat</w:t>
+      </w:r>
+      <w:r>
+        <w:t xml:space="preserve"> </w:t>
+      </w:r>
+      <w:r>
+        <w:t xml:space="preserve">- Интеграция AI-моделей с базами данных Platonus (MySQL) и Canvas LMS для безопасного доступа к академическим профилям, расписанию и оценкам</w:t>
+      </w:r>
+      <w:r>
+        <w:t xml:space="preserve"> </w:t>
+      </w:r>
+      <w:r>
+        <w:t xml:space="preserve">- Создание кастомных AI чат-ботов и агентов для преподавателей: автоматизированный аудит силлабусов, проверка академических стандартов и генерация рецензий</w:t>
+      </w:r>
+      <w:r>
+        <w:t xml:space="preserve"> </w:t>
+      </w:r>
+      <w:r>
+        <w:t xml:space="preserve">- Проектирование REST API, шлюза авторизации API-ключей, дашборда мониторинга, Docker-контейнеризации и деплоя на серверы вуза</w:t>
+      </w:r>
+    </w:p>
+    <w:bookmarkEnd w:id="15"/>
+    <w:bookmarkStart w:id="16" w:name="Xfd10941811e170a2ba65e7f74a56307a700f8e2"/>
     <w:p>
       <w:pPr>
         <w:pStyle w:val="Heading3"/>
@@ -270,8 +469,8 @@
         <w:t xml:space="preserve">- Интегрировал AI мониторинг действий пользователей</w:t>
       </w:r>
     </w:p>
-    <w:bookmarkEnd w:id="12"/>
-    <w:bookmarkStart w:id="13" w:name="Xe6b29b7d7e31819fac8f682fc25b0264751b299"/>
+    <w:bookmarkEnd w:id="16"/>
+    <w:bookmarkStart w:id="17" w:name="Xe6b29b7d7e31819fac8f682fc25b0264751b299"/>
     <w:p>
       <w:pPr>
         <w:pStyle w:val="Heading3"/>
@@ -316,14 +515,14 @@
         <w:t xml:space="preserve">- Интерграция с сервером, i18n, theme-switcher, context</w:t>
       </w:r>
     </w:p>
-    <w:bookmarkEnd w:id="13"/>
-    <w:bookmarkStart w:id="14" w:name="X50e1e699507765baaee9b1af77afff02e1ca1c1"/>
+    <w:bookmarkEnd w:id="17"/>
+    <w:bookmarkStart w:id="18" w:name="X4fce476243f8ed3a44fc9121feb90d0dcb9f11e"/>
     <w:p>
       <w:pPr>
         <w:pStyle w:val="Heading3"/>
       </w:pPr>
       <w:r>
-        <w:t xml:space="preserve">Narxoz AI Studio | Next.js | Frontend-разработчик</w:t>
+        <w:t xml:space="preserve">E-queue Narxoz | Next.js | Frontend-разработчик</w:t>
       </w:r>
     </w:p>
     <w:p>
@@ -362,54 +561,18 @@
         <w:t xml:space="preserve">- Оптимизация программного кода</w:t>
       </w:r>
     </w:p>
-    <w:bookmarkEnd w:id="14"/>
-    <w:bookmarkEnd w:id="15"/>
-    <w:bookmarkStart w:id="16" w:name="образование"/>
+    <w:bookmarkEnd w:id="18"/>
+    <w:bookmarkEnd w:id="19"/>
+    <w:bookmarkStart w:id="43" w:name="X77a96e76957e614b72ead514b9b9872b1c1dc53"/>
     <w:p>
       <w:pPr>
         <w:pStyle w:val="Heading2"/>
       </w:pPr>
       <w:r>
-        <w:t xml:space="preserve">Образование</w:t>
-      </w:r>
-    </w:p>
-    <w:p>
-      <w:pPr>
-        <w:pStyle w:val="FirstParagraph"/>
-      </w:pPr>
-      <w:r>
-        <w:t xml:space="preserve">Форма обучение: Очное</w:t>
-      </w:r>
-      <w:r>
-        <w:br/>
-      </w:r>
-      <w:r>
-        <w:t xml:space="preserve">Университет: НАО “Университет Нархоз”</w:t>
-      </w:r>
-      <w:r>
-        <w:br/>
-      </w:r>
-      <w:r>
-        <w:t xml:space="preserve">Год окончание: 2027, неоконченный высший</w:t>
-      </w:r>
-      <w:r>
-        <w:br/>
-      </w:r>
-      <w:r>
-        <w:t xml:space="preserve">Специальность: IT 6B06103 “Digital Engineering”</w:t>
-      </w:r>
-    </w:p>
-    <w:bookmarkEnd w:id="16"/>
-    <w:bookmarkStart w:id="38" w:name="X77a96e76957e614b72ead514b9b9872b1c1dc53"/>
-    <w:p>
-      <w:pPr>
-        <w:pStyle w:val="Heading2"/>
-      </w:pPr>
-      <w:r>
         <w:t xml:space="preserve">Проекты (через ссылку можно увидеть скриншоты, код, или пробовать проект)</w:t>
       </w:r>
     </w:p>
-    <w:bookmarkStart w:id="25" w:name="веб-сайты"/>
+    <w:bookmarkStart w:id="30" w:name="веб-сайты"/>
     <w:p>
       <w:pPr>
         <w:pStyle w:val="Heading3"/>
@@ -426,7 +589,125 @@
           <w:numId w:val="1002"/>
         </w:numPr>
       </w:pPr>
-      <w:hyperlink r:id="rId17">
+      <w:hyperlink r:id="rId20">
+        <w:r>
+          <w:rPr>
+            <w:rStyle w:val="Hyperlink"/>
+          </w:rPr>
+          <w:t xml:space="preserve">xVenture</w:t>
+        </w:r>
+      </w:hyperlink>
+      <w:r>
+        <w:t xml:space="preserve"> </w:t>
+      </w:r>
+      <w:r>
+        <w:t xml:space="preserve">—</w:t>
+      </w:r>
+      <w:r>
+        <w:t xml:space="preserve"> </w:t>
+      </w:r>
+      <w:r>
+        <w:t xml:space="preserve">Screenshots</w:t>
+      </w:r>
+      <w:r>
+        <w:t xml:space="preserve"> </w:t>
+      </w:r>
+      <w:r>
+        <w:t xml:space="preserve">Production Link</w:t>
+      </w:r>
+      <w:r>
+        <w:t xml:space="preserve"> </w:t>
+      </w:r>
+      <w:r>
+        <w:t xml:space="preserve">Next.js</w:t>
+      </w:r>
+      <w:r>
+        <w:t xml:space="preserve"> </w:t>
+      </w:r>
+      <w:r>
+        <w:t xml:space="preserve">Tailwind</w:t>
+      </w:r>
+      <w:r>
+        <w:t xml:space="preserve"> </w:t>
+      </w:r>
+      <w:r>
+        <w:t xml:space="preserve">PSQL</w:t>
+      </w:r>
+      <w:r>
+        <w:t xml:space="preserve"> </w:t>
+      </w:r>
+      <w:r>
+        <w:t xml:space="preserve">Gemini AI</w:t>
+      </w:r>
+    </w:p>
+    <w:p>
+      <w:pPr>
+        <w:pStyle w:val="Compact"/>
+        <w:numPr>
+          <w:ilvl w:val="0"/>
+          <w:numId w:val="1002"/>
+        </w:numPr>
+      </w:pPr>
+      <w:hyperlink r:id="rId21">
+        <w:r>
+          <w:rPr>
+            <w:rStyle w:val="Hyperlink"/>
+          </w:rPr>
+          <w:t xml:space="preserve">orderCup</w:t>
+        </w:r>
+      </w:hyperlink>
+      <w:r>
+        <w:t xml:space="preserve"> </w:t>
+      </w:r>
+      <w:r>
+        <w:t xml:space="preserve">—</w:t>
+      </w:r>
+      <w:r>
+        <w:t xml:space="preserve"> </w:t>
+      </w:r>
+      <w:r>
+        <w:t xml:space="preserve">Screenshots</w:t>
+      </w:r>
+      <w:r>
+        <w:t xml:space="preserve"> </w:t>
+      </w:r>
+      <w:r>
+        <w:t xml:space="preserve">Source Code</w:t>
+      </w:r>
+      <w:r>
+        <w:t xml:space="preserve"> </w:t>
+      </w:r>
+      <w:r>
+        <w:t xml:space="preserve">Next.js</w:t>
+      </w:r>
+      <w:r>
+        <w:t xml:space="preserve"> </w:t>
+      </w:r>
+      <w:r>
+        <w:t xml:space="preserve">Tailwind</w:t>
+      </w:r>
+      <w:r>
+        <w:t xml:space="preserve"> </w:t>
+      </w:r>
+      <w:r>
+        <w:t xml:space="preserve">PSQL</w:t>
+      </w:r>
+      <w:r>
+        <w:t xml:space="preserve"> </w:t>
+      </w:r>
+      <w:r>
+        <w:t xml:space="preserve">Drizzle</w:t>
+      </w:r>
+    </w:p>
+    <w:p>
+      <w:pPr>
+        <w:pStyle w:val="Compact"/>
+        <w:numPr>
+          <w:ilvl w:val="0"/>
+          <w:numId w:val="1002"/>
+        </w:numPr>
+      </w:pPr>
+      <w:hyperlink r:id="rId22">
         <w:r>
           <w:rPr>
             <w:rStyle w:val="Hyperlink"/>
@@ -473,7 +754,7 @@
           <w:numId w:val="1002"/>
         </w:numPr>
       </w:pPr>
-      <w:hyperlink r:id="rId18">
+      <w:hyperlink r:id="rId23">
         <w:r>
           <w:rPr>
             <w:rStyle w:val="Hyperlink"/>
@@ -520,7 +801,7 @@
           <w:numId w:val="1002"/>
         </w:numPr>
       </w:pPr>
-      <w:hyperlink r:id="rId19">
+      <w:hyperlink r:id="rId24">
         <w:r>
           <w:rPr>
             <w:rStyle w:val="Hyperlink"/>
@@ -579,7 +860,7 @@
           <w:numId w:val="1002"/>
         </w:numPr>
       </w:pPr>
-      <w:hyperlink r:id="rId20">
+      <w:hyperlink r:id="rId25">
         <w:r>
           <w:rPr>
             <w:rStyle w:val="Hyperlink"/>
@@ -626,7 +907,7 @@
           <w:numId w:val="1002"/>
         </w:numPr>
       </w:pPr>
-      <w:hyperlink r:id="rId21">
+      <w:hyperlink r:id="rId26">
         <w:r>
           <w:rPr>
             <w:rStyle w:val="Hyperlink"/>
@@ -679,7 +960,7 @@
           <w:numId w:val="1002"/>
         </w:numPr>
       </w:pPr>
-      <w:hyperlink r:id="rId22">
+      <w:hyperlink r:id="rId27">
         <w:r>
           <w:rPr>
             <w:rStyle w:val="Hyperlink"/>
@@ -732,7 +1013,7 @@
           <w:numId w:val="1002"/>
         </w:numPr>
       </w:pPr>
-      <w:hyperlink r:id="rId23">
+      <w:hyperlink r:id="rId28">
         <w:r>
           <w:rPr>
             <w:rStyle w:val="Hyperlink"/>
@@ -779,7 +1060,7 @@
           <w:numId w:val="1002"/>
         </w:numPr>
       </w:pPr>
-      <w:hyperlink r:id="rId24">
+      <w:hyperlink r:id="rId29">
         <w:r>
           <w:rPr>
             <w:rStyle w:val="Hyperlink"/>
@@ -818,8 +1099,8 @@
         <w:t xml:space="preserve">CSS</w:t>
       </w:r>
     </w:p>
-    <w:bookmarkEnd w:id="25"/>
-    <w:bookmarkStart w:id="30" w:name="мобильные-приложений"/>
+    <w:bookmarkEnd w:id="30"/>
+    <w:bookmarkStart w:id="35" w:name="мобильные-приложений"/>
     <w:p>
       <w:pPr>
         <w:pStyle w:val="Heading3"/>
@@ -836,7 +1117,7 @@
           <w:numId w:val="1003"/>
         </w:numPr>
       </w:pPr>
-      <w:hyperlink r:id="rId26">
+      <w:hyperlink r:id="rId31">
         <w:r>
           <w:rPr>
             <w:rStyle w:val="Hyperlink"/>
@@ -877,7 +1158,7 @@
           <w:numId w:val="1003"/>
         </w:numPr>
       </w:pPr>
-      <w:hyperlink r:id="rId27">
+      <w:hyperlink r:id="rId32">
         <w:r>
           <w:rPr>
             <w:rStyle w:val="Hyperlink"/>
@@ -912,7 +1193,7 @@
           <w:numId w:val="1003"/>
         </w:numPr>
       </w:pPr>
-      <w:hyperlink r:id="rId28">
+      <w:hyperlink r:id="rId33">
         <w:r>
           <w:rPr>
             <w:rStyle w:val="Hyperlink"/>
@@ -953,7 +1234,7 @@
           <w:numId w:val="1003"/>
         </w:numPr>
       </w:pPr>
-      <w:hyperlink r:id="rId29">
+      <w:hyperlink r:id="rId34">
         <w:r>
           <w:rPr>
             <w:rStyle w:val="Hyperlink"/>
@@ -992,8 +1273,8 @@
         <w:t xml:space="preserve">Gemini AI</w:t>
       </w:r>
     </w:p>
-    <w:bookmarkEnd w:id="30"/>
-    <w:bookmarkStart w:id="35" w:name="серверный-приложений"/>
+    <w:bookmarkEnd w:id="35"/>
+    <w:bookmarkStart w:id="40" w:name="серверный-приложений"/>
     <w:p>
       <w:pPr>
         <w:pStyle w:val="Heading3"/>
@@ -1010,7 +1291,7 @@
           <w:numId w:val="1004"/>
         </w:numPr>
       </w:pPr>
-      <w:hyperlink r:id="rId31">
+      <w:hyperlink r:id="rId36">
         <w:r>
           <w:rPr>
             <w:rStyle w:val="Hyperlink"/>
@@ -1057,7 +1338,7 @@
           <w:numId w:val="1004"/>
         </w:numPr>
       </w:pPr>
-      <w:hyperlink r:id="rId32">
+      <w:hyperlink r:id="rId37">
         <w:r>
           <w:rPr>
             <w:rStyle w:val="Hyperlink"/>
@@ -1104,7 +1385,7 @@
           <w:numId w:val="1004"/>
         </w:numPr>
       </w:pPr>
-      <w:hyperlink r:id="rId33">
+      <w:hyperlink r:id="rId38">
         <w:r>
           <w:rPr>
             <w:rStyle w:val="Hyperlink"/>
@@ -1163,7 +1444,7 @@
           <w:numId w:val="1004"/>
         </w:numPr>
       </w:pPr>
-      <w:hyperlink r:id="rId34">
+      <w:hyperlink r:id="rId39">
         <w:r>
           <w:rPr>
             <w:rStyle w:val="Hyperlink"/>
@@ -1202,8 +1483,8 @@
         <w:t xml:space="preserve">SQLite</w:t>
       </w:r>
     </w:p>
-    <w:bookmarkEnd w:id="35"/>
-    <w:bookmarkStart w:id="37" w:name="terminal-script"/>
+    <w:bookmarkEnd w:id="40"/>
+    <w:bookmarkStart w:id="42" w:name="terminal-script"/>
     <w:p>
       <w:pPr>
         <w:pStyle w:val="Heading3"/>
@@ -1220,7 +1501,7 @@
           <w:numId w:val="1005"/>
         </w:numPr>
       </w:pPr>
-      <w:hyperlink r:id="rId36">
+      <w:hyperlink r:id="rId41">
         <w:r>
           <w:rPr>
             <w:rStyle w:val="Hyperlink"/>
@@ -1265,48 +1546,777 @@
         <w:t xml:space="preserve">Python</w:t>
       </w:r>
     </w:p>
-    <w:p>
-      <w:r>
-        <w:pict>
-          <v:rect style="width:0;height:1.5pt" o:hralign="center" o:hrstd="t" o:hr="t"/>
-        </w:pict>
-      </w:r>
-    </w:p>
-    <w:bookmarkEnd w:id="37"/>
-    <w:bookmarkEnd w:id="38"/>
-    <w:bookmarkStart w:id="40" w:name="жизненная-активность"/>
+    <w:bookmarkEnd w:id="42"/>
+    <w:bookmarkEnd w:id="43"/>
+    <w:bookmarkStart w:id="58" w:name="сертификаты"/>
     <w:p>
       <w:pPr>
         <w:pStyle w:val="Heading2"/>
       </w:pPr>
       <w:r>
-        <w:t xml:space="preserve">Жизненная активность</w:t>
-      </w:r>
-    </w:p>
-    <w:p>
-      <w:pPr>
-        <w:pStyle w:val="FirstParagraph"/>
-      </w:pPr>
-      <w:r>
-        <w:t xml:space="preserve">Вы можете посмотреть подробный список моих активностей (участие в хакатонах, инкубаторах, ивентах) с фотографиями в отдельном файле</w:t>
-      </w:r>
-      <w:r>
-        <w:t xml:space="preserve"> </w:t>
-      </w:r>
-      <w:hyperlink r:id="rId39">
+        <w:t xml:space="preserve">Сертификаты</w:t>
+      </w:r>
+    </w:p>
+    <w:bookmarkStart w:id="52" w:name="halyk-events"/>
+    <w:p>
+      <w:pPr>
+        <w:pStyle w:val="Heading3"/>
+      </w:pPr>
+      <w:r>
+        <w:t xml:space="preserve">Halyk Events</w:t>
+      </w:r>
+    </w:p>
+    <w:p>
+      <w:pPr>
+        <w:pStyle w:val="Compact"/>
+        <w:numPr>
+          <w:ilvl w:val="0"/>
+          <w:numId w:val="1006"/>
+        </w:numPr>
+      </w:pPr>
+      <w:r>
+        <w:rPr>
+          <w:b/>
+          <w:bCs/>
+        </w:rPr>
+        <w:t xml:space="preserve">SuperApps &amp; MiniApps Meetup</w:t>
+      </w:r>
+      <w:r>
+        <w:t xml:space="preserve"> </w:t>
+      </w:r>
+      <w:r>
+        <w:t xml:space="preserve">—</w:t>
+      </w:r>
+      <w:r>
+        <w:t xml:space="preserve"> </w:t>
+      </w:r>
+      <w:hyperlink r:id="rId44">
         <w:r>
           <w:rPr>
             <w:rStyle w:val="Hyperlink"/>
           </w:rPr>
-          <w:t xml:space="preserve">life-activities.md</w:t>
+          <w:t xml:space="preserve">Оригинал PDF</w:t>
         </w:r>
       </w:hyperlink>
       <w:r>
-        <w:t xml:space="preserve">.</w:t>
-      </w:r>
-    </w:p>
-    <w:bookmarkEnd w:id="40"/>
-    <w:bookmarkEnd w:id="41"/>
+        <w:t xml:space="preserve"> </w:t>
+      </w:r>
+      <w:r>
+        <w:t xml:space="preserve">|</w:t>
+      </w:r>
+      <w:r>
+        <w:t xml:space="preserve"> </w:t>
+      </w:r>
+      <w:hyperlink r:id="rId45">
+        <w:r>
+          <w:rPr>
+            <w:rStyle w:val="Hyperlink"/>
+          </w:rPr>
+          <w:t xml:space="preserve">Ссылка аккредитации</w:t>
+        </w:r>
+      </w:hyperlink>
+    </w:p>
+    <w:p>
+      <w:pPr>
+        <w:pStyle w:val="Compact"/>
+        <w:numPr>
+          <w:ilvl w:val="0"/>
+          <w:numId w:val="1006"/>
+        </w:numPr>
+      </w:pPr>
+      <w:r>
+        <w:rPr>
+          <w:b/>
+          <w:bCs/>
+        </w:rPr>
+        <w:t xml:space="preserve">Cybersecurity &amp; Antifraud Meetup</w:t>
+      </w:r>
+      <w:r>
+        <w:t xml:space="preserve"> </w:t>
+      </w:r>
+      <w:r>
+        <w:t xml:space="preserve">—</w:t>
+      </w:r>
+      <w:r>
+        <w:t xml:space="preserve"> </w:t>
+      </w:r>
+      <w:hyperlink r:id="rId46">
+        <w:r>
+          <w:rPr>
+            <w:rStyle w:val="Hyperlink"/>
+          </w:rPr>
+          <w:t xml:space="preserve">Оригинал PDF</w:t>
+        </w:r>
+      </w:hyperlink>
+      <w:r>
+        <w:t xml:space="preserve"> </w:t>
+      </w:r>
+      <w:r>
+        <w:t xml:space="preserve">|</w:t>
+      </w:r>
+      <w:r>
+        <w:t xml:space="preserve"> </w:t>
+      </w:r>
+      <w:hyperlink r:id="rId45">
+        <w:r>
+          <w:rPr>
+            <w:rStyle w:val="Hyperlink"/>
+          </w:rPr>
+          <w:t xml:space="preserve">Ссылка аккредитации</w:t>
+        </w:r>
+      </w:hyperlink>
+    </w:p>
+    <w:p>
+      <w:pPr>
+        <w:pStyle w:val="Compact"/>
+        <w:numPr>
+          <w:ilvl w:val="0"/>
+          <w:numId w:val="1006"/>
+        </w:numPr>
+      </w:pPr>
+      <w:r>
+        <w:rPr>
+          <w:b/>
+          <w:bCs/>
+        </w:rPr>
+        <w:t xml:space="preserve">Ecosystem Meetup</w:t>
+      </w:r>
+      <w:r>
+        <w:t xml:space="preserve"> </w:t>
+      </w:r>
+      <w:r>
+        <w:t xml:space="preserve">—</w:t>
+      </w:r>
+      <w:r>
+        <w:t xml:space="preserve"> </w:t>
+      </w:r>
+      <w:hyperlink r:id="rId47">
+        <w:r>
+          <w:rPr>
+            <w:rStyle w:val="Hyperlink"/>
+          </w:rPr>
+          <w:t xml:space="preserve">Оригинал PDF</w:t>
+        </w:r>
+      </w:hyperlink>
+      <w:r>
+        <w:t xml:space="preserve"> </w:t>
+      </w:r>
+      <w:r>
+        <w:t xml:space="preserve">|</w:t>
+      </w:r>
+      <w:r>
+        <w:t xml:space="preserve"> </w:t>
+      </w:r>
+      <w:hyperlink r:id="rId45">
+        <w:r>
+          <w:rPr>
+            <w:rStyle w:val="Hyperlink"/>
+          </w:rPr>
+          <w:t xml:space="preserve">Ссылка аккредитации</w:t>
+        </w:r>
+      </w:hyperlink>
+    </w:p>
+    <w:p>
+      <w:pPr>
+        <w:pStyle w:val="Compact"/>
+        <w:numPr>
+          <w:ilvl w:val="0"/>
+          <w:numId w:val="1006"/>
+        </w:numPr>
+      </w:pPr>
+      <w:r>
+        <w:rPr>
+          <w:b/>
+          <w:bCs/>
+        </w:rPr>
+        <w:t xml:space="preserve">BaaS Ecosystems Meetup</w:t>
+      </w:r>
+      <w:r>
+        <w:t xml:space="preserve"> </w:t>
+      </w:r>
+      <w:r>
+        <w:t xml:space="preserve">—</w:t>
+      </w:r>
+      <w:r>
+        <w:t xml:space="preserve"> </w:t>
+      </w:r>
+      <w:hyperlink r:id="rId48">
+        <w:r>
+          <w:rPr>
+            <w:rStyle w:val="Hyperlink"/>
+          </w:rPr>
+          <w:t xml:space="preserve">Оригинал PDF</w:t>
+        </w:r>
+      </w:hyperlink>
+      <w:r>
+        <w:t xml:space="preserve"> </w:t>
+      </w:r>
+      <w:r>
+        <w:t xml:space="preserve">|</w:t>
+      </w:r>
+      <w:r>
+        <w:t xml:space="preserve"> </w:t>
+      </w:r>
+      <w:hyperlink r:id="rId49">
+        <w:r>
+          <w:rPr>
+            <w:rStyle w:val="Hyperlink"/>
+          </w:rPr>
+          <w:t xml:space="preserve">Ссылка аккредитации</w:t>
+        </w:r>
+      </w:hyperlink>
+    </w:p>
+    <w:p>
+      <w:pPr>
+        <w:pStyle w:val="Compact"/>
+        <w:numPr>
+          <w:ilvl w:val="0"/>
+          <w:numId w:val="1006"/>
+        </w:numPr>
+      </w:pPr>
+      <w:r>
+        <w:rPr>
+          <w:b/>
+          <w:bCs/>
+        </w:rPr>
+        <w:t xml:space="preserve">AI Meetup</w:t>
+      </w:r>
+      <w:r>
+        <w:t xml:space="preserve"> </w:t>
+      </w:r>
+      <w:r>
+        <w:t xml:space="preserve">—</w:t>
+      </w:r>
+      <w:r>
+        <w:t xml:space="preserve"> </w:t>
+      </w:r>
+      <w:hyperlink r:id="rId50">
+        <w:r>
+          <w:rPr>
+            <w:rStyle w:val="Hyperlink"/>
+          </w:rPr>
+          <w:t xml:space="preserve">Оригинал PDF</w:t>
+        </w:r>
+      </w:hyperlink>
+      <w:r>
+        <w:t xml:space="preserve"> </w:t>
+      </w:r>
+      <w:r>
+        <w:t xml:space="preserve">|</w:t>
+      </w:r>
+      <w:r>
+        <w:t xml:space="preserve"> </w:t>
+      </w:r>
+      <w:hyperlink r:id="rId51">
+        <w:r>
+          <w:rPr>
+            <w:rStyle w:val="Hyperlink"/>
+          </w:rPr>
+          <w:t xml:space="preserve">Ссылка аккредитации</w:t>
+        </w:r>
+      </w:hyperlink>
+    </w:p>
+    <w:p>
+      <w:pPr>
+        <w:pStyle w:val="FirstParagraph"/>
+      </w:pPr>
+      <w:r>
+        <w:t xml:space="preserve"> </w:t>
+      </w:r>
+      <w:r>
+        <w:t xml:space="preserve"> </w:t>
+      </w:r>
+      <w:r>
+        <w:t xml:space="preserve"> </w:t>
+      </w:r>
+      <w:r>
+        <w:t xml:space="preserve"> </w:t>
+      </w:r>
+      <w:r>
+        <w:t xml:space="preserve"> </w:t>
+      </w:r>
+      <w:r>
+        <w:t xml:space="preserve"> </w:t>
+      </w:r>
+      <w:r>
+        <w:t xml:space="preserve"> </w:t>
+      </w:r>
+    </w:p>
+    <w:bookmarkEnd w:id="52"/>
+    <w:bookmarkStart w:id="57" w:name="coursera"/>
+    <w:p>
+      <w:pPr>
+        <w:pStyle w:val="Heading3"/>
+      </w:pPr>
+      <w:r>
+        <w:t xml:space="preserve">Coursera</w:t>
+      </w:r>
+    </w:p>
+    <w:p>
+      <w:pPr>
+        <w:pStyle w:val="Compact"/>
+        <w:numPr>
+          <w:ilvl w:val="0"/>
+          <w:numId w:val="1007"/>
+        </w:numPr>
+      </w:pPr>
+      <w:r>
+        <w:rPr>
+          <w:b/>
+          <w:bCs/>
+        </w:rPr>
+        <w:t xml:space="preserve">Understanding Research Methods</w:t>
+      </w:r>
+      <w:r>
+        <w:t xml:space="preserve"> </w:t>
+      </w:r>
+      <w:r>
+        <w:t xml:space="preserve">(University of London &amp; SOAS University of London) —</w:t>
+      </w:r>
+      <w:r>
+        <w:t xml:space="preserve"> </w:t>
+      </w:r>
+      <w:hyperlink r:id="rId53">
+        <w:r>
+          <w:rPr>
+            <w:rStyle w:val="Hyperlink"/>
+          </w:rPr>
+          <w:t xml:space="preserve">Оригинал PDF</w:t>
+        </w:r>
+      </w:hyperlink>
+      <w:r>
+        <w:t xml:space="preserve"> </w:t>
+      </w:r>
+      <w:r>
+        <w:t xml:space="preserve">|</w:t>
+      </w:r>
+      <w:r>
+        <w:t xml:space="preserve"> </w:t>
+      </w:r>
+      <w:hyperlink r:id="rId54">
+        <w:r>
+          <w:rPr>
+            <w:rStyle w:val="Hyperlink"/>
+          </w:rPr>
+          <w:t xml:space="preserve">Ссылка аккредитации</w:t>
+        </w:r>
+      </w:hyperlink>
+    </w:p>
+    <w:p>
+      <w:pPr>
+        <w:pStyle w:val="Compact"/>
+        <w:numPr>
+          <w:ilvl w:val="0"/>
+          <w:numId w:val="1007"/>
+        </w:numPr>
+      </w:pPr>
+      <w:r>
+        <w:rPr>
+          <w:b/>
+          <w:bCs/>
+        </w:rPr>
+        <w:t xml:space="preserve">Research Methodologies</w:t>
+      </w:r>
+      <w:r>
+        <w:t xml:space="preserve"> </w:t>
+      </w:r>
+      <w:r>
+        <w:t xml:space="preserve">(Queen Mary University of London) —</w:t>
+      </w:r>
+      <w:r>
+        <w:t xml:space="preserve"> </w:t>
+      </w:r>
+      <w:hyperlink r:id="rId55">
+        <w:r>
+          <w:rPr>
+            <w:rStyle w:val="Hyperlink"/>
+          </w:rPr>
+          <w:t xml:space="preserve">Оригинал PDF</w:t>
+        </w:r>
+      </w:hyperlink>
+      <w:r>
+        <w:t xml:space="preserve"> </w:t>
+      </w:r>
+      <w:r>
+        <w:t xml:space="preserve">|</w:t>
+      </w:r>
+      <w:r>
+        <w:t xml:space="preserve"> </w:t>
+      </w:r>
+      <w:hyperlink r:id="rId56">
+        <w:r>
+          <w:rPr>
+            <w:rStyle w:val="Hyperlink"/>
+          </w:rPr>
+          <w:t xml:space="preserve">Ссылка аккредитации</w:t>
+        </w:r>
+      </w:hyperlink>
+    </w:p>
+    <w:p>
+      <w:pPr>
+        <w:pStyle w:val="FirstParagraph"/>
+      </w:pPr>
+      <w:r>
+        <w:t xml:space="preserve"> </w:t>
+      </w:r>
+      <w:r>
+        <w:t xml:space="preserve"> </w:t>
+      </w:r>
+    </w:p>
+    <w:p>
+      <w:r>
+        <w:pict>
+          <v:rect style="width:0;height:1.5pt" o:hralign="center" o:hrstd="t" o:hr="t"/>
+        </w:pict>
+      </w:r>
+    </w:p>
+    <w:bookmarkEnd w:id="57"/>
+    <w:bookmarkEnd w:id="58"/>
+    <w:bookmarkStart w:id="59" w:name="образование"/>
+    <w:p>
+      <w:pPr>
+        <w:pStyle w:val="Heading2"/>
+      </w:pPr>
+      <w:r>
+        <w:t xml:space="preserve">Образование</w:t>
+      </w:r>
+    </w:p>
+    <w:p>
+      <w:pPr>
+        <w:pStyle w:val="FirstParagraph"/>
+      </w:pPr>
+      <w:r>
+        <w:t xml:space="preserve">Форма обучение: Очное</w:t>
+      </w:r>
+      <w:r>
+        <w:br/>
+      </w:r>
+      <w:r>
+        <w:t xml:space="preserve">Университет: НАО “Университет Нархоз”</w:t>
+      </w:r>
+      <w:r>
+        <w:br/>
+      </w:r>
+      <w:r>
+        <w:t xml:space="preserve">Год окончание: 2027, неоконченный высший</w:t>
+      </w:r>
+      <w:r>
+        <w:br/>
+      </w:r>
+      <w:r>
+        <w:t xml:space="preserve">Специальность: IT 6B06103 “Digital Engineering”</w:t>
+      </w:r>
+    </w:p>
+    <w:bookmarkEnd w:id="59"/>
+    <w:bookmarkStart w:id="70" w:name="жизненная-активность-достижения"/>
+    <w:p>
+      <w:pPr>
+        <w:pStyle w:val="Heading2"/>
+      </w:pPr>
+      <w:r>
+        <w:t xml:space="preserve">Жизненная активность &amp; Достижения</w:t>
+      </w:r>
+    </w:p>
+    <w:bookmarkStart w:id="60" w:name="X1731e9eb8ab8d4eecb7244ca2f5d6f9dc87d1c2"/>
+    <w:p>
+      <w:pPr>
+        <w:pStyle w:val="Heading3"/>
+      </w:pPr>
+      <w:r>
+        <w:t xml:space="preserve">Тестирование продукта</w:t>
+      </w:r>
+      <w:r>
+        <w:t xml:space="preserve"> </w:t>
+      </w:r>
+      <w:hyperlink r:id="rId24">
+        <w:r>
+          <w:rPr>
+            <w:rStyle w:val="Hyperlink"/>
+          </w:rPr>
+          <w:t xml:space="preserve">Mizucare</w:t>
+        </w:r>
+      </w:hyperlink>
+      <w:r>
+        <w:t xml:space="preserve"> </w:t>
+      </w:r>
+      <w:r>
+        <w:t xml:space="preserve">на реальных пользователях</w:t>
+      </w:r>
+    </w:p>
+    <w:p>
+      <w:pPr>
+        <w:pStyle w:val="FirstParagraph"/>
+      </w:pPr>
+      <w:r>
+        <w:t xml:space="preserve">Непосредственное общение с аудиторией для сбора отзывов, проверки удобства использования интерфейса и доработки UX.</w:t>
+      </w:r>
+      <w:r>
+        <w:t xml:space="preserve"> </w:t>
+      </w:r>
+      <w:r>
+        <w:t xml:space="preserve"> </w:t>
+      </w:r>
+      <w:r>
+        <w:t xml:space="preserve"> </w:t>
+      </w:r>
+    </w:p>
+    <w:bookmarkEnd w:id="60"/>
+    <w:bookmarkStart w:id="61" w:name="X73dd0c8e63cc39b2257b7c21e3a50b128c46cc0"/>
+    <w:p>
+      <w:pPr>
+        <w:pStyle w:val="Heading3"/>
+      </w:pPr>
+      <w:r>
+        <w:t xml:space="preserve">Блокчейн, криптовалюты и нетворкинг на Bybit Kazakhstan</w:t>
+      </w:r>
+    </w:p>
+    <w:p>
+      <w:pPr>
+        <w:pStyle w:val="FirstParagraph"/>
+      </w:pPr>
+      <w:r>
+        <w:t xml:space="preserve">Участие в ивентах Bybit в Алматы, изучение децентрализованных технологий и трендов в криптоиндустрии, обмен опытом с комьюнити.</w:t>
+      </w:r>
+      <w:r>
+        <w:t xml:space="preserve"> </w:t>
+      </w:r>
+      <w:r>
+        <w:t xml:space="preserve"> </w:t>
+      </w:r>
+      <w:r>
+        <w:t xml:space="preserve"> </w:t>
+      </w:r>
+    </w:p>
+    <w:bookmarkEnd w:id="61"/>
+    <w:bookmarkStart w:id="62" w:name="abc-incubation-выход-в-финал"/>
+    <w:p>
+      <w:pPr>
+        <w:pStyle w:val="Heading3"/>
+      </w:pPr>
+      <w:r>
+        <w:t xml:space="preserve">ABC Incubation — Выход в финал</w:t>
+      </w:r>
+    </w:p>
+    <w:p>
+      <w:pPr>
+        <w:pStyle w:val="FirstParagraph"/>
+      </w:pPr>
+      <w:r>
+        <w:t xml:space="preserve">Проектирование и защита мобильного стартапа</w:t>
+      </w:r>
+      <w:r>
+        <w:t xml:space="preserve"> </w:t>
+      </w:r>
+      <w:hyperlink r:id="rId31">
+        <w:r>
+          <w:rPr>
+            <w:rStyle w:val="Hyperlink"/>
+          </w:rPr>
+          <w:t xml:space="preserve">Tekser</w:t>
+        </w:r>
+      </w:hyperlink>
+      <w:r>
+        <w:t xml:space="preserve"> </w:t>
+      </w:r>
+      <w:r>
+        <w:t xml:space="preserve">в рамках инкубатора NURIS (Назарбаев Университет). Прошел полный цикл от идеи до рабочей презентации перед экспертами.</w:t>
+      </w:r>
+      <w:r>
+        <w:t xml:space="preserve"> </w:t>
+      </w:r>
+      <w:r>
+        <w:t xml:space="preserve"> </w:t>
+      </w:r>
+      <w:r>
+        <w:t xml:space="preserve"> </w:t>
+      </w:r>
+    </w:p>
+    <w:bookmarkEnd w:id="62"/>
+    <w:bookmarkStart w:id="63" w:name="участие-в-хакатоне-halyk-oyi-tech-iii"/>
+    <w:p>
+      <w:pPr>
+        <w:pStyle w:val="Heading3"/>
+      </w:pPr>
+      <w:r>
+        <w:t xml:space="preserve">Участие в хакатоне Halyk Oyi Tech III</w:t>
+      </w:r>
+    </w:p>
+    <w:p>
+      <w:pPr>
+        <w:pStyle w:val="FirstParagraph"/>
+      </w:pPr>
+      <w:r>
+        <w:t xml:space="preserve">Разработка финтех-прототипов и интенсивная командная работа в условиях жестких временных рамок.</w:t>
+      </w:r>
+      <w:r>
+        <w:t xml:space="preserve"> </w:t>
+      </w:r>
+      <w:r>
+        <w:t xml:space="preserve"> </w:t>
+      </w:r>
+      <w:r>
+        <w:t xml:space="preserve"> </w:t>
+      </w:r>
+    </w:p>
+    <w:bookmarkEnd w:id="63"/>
+    <w:bookmarkStart w:id="64" w:name="выступление-в-качестве-спикера-на-muit"/>
+    <w:p>
+      <w:pPr>
+        <w:pStyle w:val="Heading3"/>
+      </w:pPr>
+      <w:r>
+        <w:t xml:space="preserve">Выступление в качестве спикера на MUIT</w:t>
+      </w:r>
+    </w:p>
+    <w:p>
+      <w:pPr>
+        <w:pStyle w:val="FirstParagraph"/>
+      </w:pPr>
+      <w:r>
+        <w:t xml:space="preserve">Помощь участникам стартап-питчингов в подготовке презентаций, проработке идей и уверенном выступлении перед инвесторами.</w:t>
+      </w:r>
+      <w:r>
+        <w:t xml:space="preserve"> </w:t>
+      </w:r>
+      <w:r>
+        <w:t xml:space="preserve"> </w:t>
+      </w:r>
+      <w:r>
+        <w:t xml:space="preserve"> </w:t>
+      </w:r>
+    </w:p>
+    <w:bookmarkEnd w:id="64"/>
+    <w:bookmarkStart w:id="65" w:name="Xeb1b7e0773f93dcfb8361a1e1570d0bb5aba24b"/>
+    <w:p>
+      <w:pPr>
+        <w:pStyle w:val="Heading3"/>
+      </w:pPr>
+      <w:r>
+        <w:t xml:space="preserve">Участие в форуме «Freedom: Кто будет востребован завтра»</w:t>
+      </w:r>
+    </w:p>
+    <w:p>
+      <w:pPr>
+        <w:pStyle w:val="FirstParagraph"/>
+      </w:pPr>
+      <w:r>
+        <w:t xml:space="preserve">Изучение трендов на финансовом и технологическом рынках труда Казахстана.</w:t>
+      </w:r>
+      <w:r>
+        <w:t xml:space="preserve"> </w:t>
+      </w:r>
+      <w:r>
+        <w:t xml:space="preserve"> </w:t>
+      </w:r>
+      <w:r>
+        <w:t xml:space="preserve"> </w:t>
+      </w:r>
+    </w:p>
+    <w:bookmarkEnd w:id="65"/>
+    <w:bookmarkStart w:id="66" w:name="мини-хакатон-от-newly-ai"/>
+    <w:p>
+      <w:pPr>
+        <w:pStyle w:val="Heading3"/>
+      </w:pPr>
+      <w:r>
+        <w:t xml:space="preserve">Мини-хакатон от Newly AI</w:t>
+      </w:r>
+    </w:p>
+    <w:p>
+      <w:pPr>
+        <w:pStyle w:val="FirstParagraph"/>
+      </w:pPr>
+      <w:r>
+        <w:t xml:space="preserve">Быстрое прототипирование решений на базе современных генеративных моделей.</w:t>
+      </w:r>
+      <w:r>
+        <w:t xml:space="preserve"> </w:t>
+      </w:r>
+      <w:r>
+        <w:t xml:space="preserve"> </w:t>
+      </w:r>
+    </w:p>
+    <w:bookmarkEnd w:id="66"/>
+    <w:bookmarkStart w:id="67" w:name="X25cd6c48adfe3d3dfd89663c9615b503bd4a543"/>
+    <w:p>
+      <w:pPr>
+        <w:pStyle w:val="Heading3"/>
+      </w:pPr>
+      <w:r>
+        <w:t xml:space="preserve">Central Asia Fintech Summit (CAFS) в Алматы</w:t>
+      </w:r>
+    </w:p>
+    <w:p>
+      <w:pPr>
+        <w:pStyle w:val="FirstParagraph"/>
+      </w:pPr>
+      <w:r>
+        <w:t xml:space="preserve">Посещение ключевого финтех-саммита Центральной Азии: изучение инноваций в цифровом банкинге, платежных технологиях, GovTech и открытых API.</w:t>
+      </w:r>
+      <w:r>
+        <w:t xml:space="preserve"> </w:t>
+      </w:r>
+      <w:r>
+        <w:t xml:space="preserve"> </w:t>
+      </w:r>
+      <w:r>
+        <w:t xml:space="preserve"> </w:t>
+      </w:r>
+    </w:p>
+    <w:bookmarkEnd w:id="67"/>
+    <w:bookmarkStart w:id="68" w:name="X5db832bdc008ef7e55b8725577faf644ffdf7c4"/>
+    <w:p>
+      <w:pPr>
+        <w:pStyle w:val="Heading3"/>
+      </w:pPr>
+      <w:r>
+        <w:t xml:space="preserve">Международный теннисный турнир ATP 250 Almaty Open</w:t>
+      </w:r>
+    </w:p>
+    <w:p>
+      <w:pPr>
+        <w:pStyle w:val="FirstParagraph"/>
+      </w:pPr>
+      <w:r>
+        <w:t xml:space="preserve">Посещение турнира мирового уровня ATP в Алматы — спортивная дисциплина, тактическое мышление и атмосфера большого тенниса.</w:t>
+      </w:r>
+      <w:r>
+        <w:t xml:space="preserve"> </w:t>
+      </w:r>
+      <w:r>
+        <w:t xml:space="preserve"> </w:t>
+      </w:r>
+      <w:r>
+        <w:t xml:space="preserve"> </w:t>
+      </w:r>
+    </w:p>
+    <w:bookmarkEnd w:id="68"/>
+    <w:bookmarkStart w:id="69" w:name="концерт-kanye-west-в-алматы"/>
+    <w:p>
+      <w:pPr>
+        <w:pStyle w:val="Heading3"/>
+      </w:pPr>
+      <w:r>
+        <w:t xml:space="preserve">Концерт Kanye West в Алматы</w:t>
+      </w:r>
+    </w:p>
+    <w:p>
+      <w:pPr>
+        <w:pStyle w:val="FirstParagraph"/>
+      </w:pPr>
+      <w:r>
+        <w:t xml:space="preserve">Посещение масштабного музыкального шоу мирового масштаба — масштабный сценический продакшн, звук и визуальная эстетика.</w:t>
+      </w:r>
+      <w:r>
+        <w:t xml:space="preserve"> </w:t>
+      </w:r>
+      <w:r>
+        <w:t xml:space="preserve"> </w:t>
+      </w:r>
+    </w:p>
+    <w:bookmarkEnd w:id="69"/>
+    <w:bookmarkEnd w:id="70"/>
+    <w:bookmarkEnd w:id="71"/>
     <w:sectPr>
       <w:footnotePr>
         <w:numRestart w:val="eachSect"/>
@@ -1536,6 +2546,12 @@
     <w:abstractNumId w:val="991"/>
   </w:num>
   <w:num w:numId="1005">
+    <w:abstractNumId w:val="991"/>
+  </w:num>
+  <w:num w:numId="1006">
+    <w:abstractNumId w:val="991"/>
+  </w:num>
+  <w:num w:numId="1007">
     <w:abstractNumId w:val="991"/>
   </w:num>
 </w:numbering>

</xml_diff>